<commit_message>
Add a true-bypass footswitch and a multimeter to the Flashover breadboard
A 3PDT footswitch switches between the circuit and a straight wire,
with an on/off LED on its third pole. The build guide gains a wiring
step for it, and the order sheet adds the footswitch, LED, LED resistor
and a multimeter (bought elsewhere).

Co-Authored-By: Claude Opus 5.5 <noreply@anthropic.com>
</commit_message>
<xml_diff>
--- a/pedals/distortion/Flashover Breadboard Tayda Order.docx
+++ b/pedals/distortion/Flashover Breadboard Tayda Order.docx
@@ -2381,6 +2381,168 @@
       <w:tr>
         <w:tc>
           <w:tcPr>
+            <w:tcW w:type="dxa" w:w="700"/>
+            <w:tcBorders>
+              <w:top w:val="single" w:color="BBBBBB" w:sz="4"/>
+              <w:left w:val="single" w:color="BBBBBB" w:sz="4"/>
+              <w:bottom w:val="single" w:color="BBBBBB" w:sz="4"/>
+              <w:right w:val="single" w:color="BBBBBB" w:sz="4"/>
+            </w:tcBorders>
+            <w:tcMar>
+              <w:top w:type="dxa" w:w="60"/>
+              <w:left w:type="dxa" w:w="100"/>
+              <w:bottom w:type="dxa" w:w="60"/>
+              <w:right w:type="dxa" w:w="100"/>
+            </w:tcMar>
+          </w:tcPr>
+          <w:p>
+            <w:pPr>
+              <w:jc w:val="center"/>
+            </w:pPr>
+            <w:r>
+              <w:rPr>
+                <w:rFonts w:ascii="Arial" w:cs="Arial" w:eastAsia="Arial" w:hAnsi="Arial"/>
+                <w:b w:val="false"/>
+                <w:bCs w:val="false"/>
+                <w:sz w:val="20"/>
+                <w:szCs w:val="20"/>
+              </w:rPr>
+              <w:t xml:space="preserve">☐</w:t>
+            </w:r>
+          </w:p>
+        </w:tc>
+        <w:tc>
+          <w:tcPr>
+            <w:tcW w:type="dxa" w:w="600"/>
+            <w:tcBorders>
+              <w:top w:val="single" w:color="BBBBBB" w:sz="4"/>
+              <w:left w:val="single" w:color="BBBBBB" w:sz="4"/>
+              <w:bottom w:val="single" w:color="BBBBBB" w:sz="4"/>
+              <w:right w:val="single" w:color="BBBBBB" w:sz="4"/>
+            </w:tcBorders>
+            <w:tcMar>
+              <w:top w:type="dxa" w:w="60"/>
+              <w:left w:type="dxa" w:w="100"/>
+              <w:bottom w:type="dxa" w:w="60"/>
+              <w:right w:type="dxa" w:w="100"/>
+            </w:tcMar>
+          </w:tcPr>
+          <w:p>
+            <w:pPr>
+              <w:jc w:val="center"/>
+            </w:pPr>
+            <w:r>
+              <w:rPr>
+                <w:rFonts w:ascii="Arial" w:cs="Arial" w:eastAsia="Arial" w:hAnsi="Arial"/>
+                <w:b w:val="false"/>
+                <w:bCs w:val="false"/>
+                <w:sz w:val="20"/>
+                <w:szCs w:val="20"/>
+              </w:rPr>
+              <w:t xml:space="preserve">10</w:t>
+            </w:r>
+          </w:p>
+        </w:tc>
+        <w:tc>
+          <w:tcPr>
+            <w:tcW w:type="dxa" w:w="2700"/>
+            <w:tcBorders>
+              <w:top w:val="single" w:color="BBBBBB" w:sz="4"/>
+              <w:left w:val="single" w:color="BBBBBB" w:sz="4"/>
+              <w:bottom w:val="single" w:color="BBBBBB" w:sz="4"/>
+              <w:right w:val="single" w:color="BBBBBB" w:sz="4"/>
+            </w:tcBorders>
+            <w:tcMar>
+              <w:top w:type="dxa" w:w="60"/>
+              <w:left w:type="dxa" w:w="100"/>
+              <w:bottom w:type="dxa" w:w="60"/>
+              <w:right w:type="dxa" w:w="100"/>
+            </w:tcMar>
+          </w:tcPr>
+          <w:p>
+            <w:pPr>
+              <w:jc w:val="left"/>
+            </w:pPr>
+            <w:r>
+              <w:rPr>
+                <w:rFonts w:ascii="Arial" w:cs="Arial" w:eastAsia="Arial" w:hAnsi="Arial"/>
+                <w:b w:val="false"/>
+                <w:bCs w:val="false"/>
+                <w:sz w:val="20"/>
+                <w:szCs w:val="20"/>
+              </w:rPr>
+              <w:t xml:space="preserve">4.7k</w:t>
+            </w:r>
+          </w:p>
+        </w:tc>
+        <w:tc>
+          <w:tcPr>
+            <w:tcW w:type="dxa" w:w="2600"/>
+            <w:tcBorders>
+              <w:top w:val="single" w:color="BBBBBB" w:sz="4"/>
+              <w:left w:val="single" w:color="BBBBBB" w:sz="4"/>
+              <w:bottom w:val="single" w:color="BBBBBB" w:sz="4"/>
+              <w:right w:val="single" w:color="BBBBBB" w:sz="4"/>
+            </w:tcBorders>
+            <w:tcMar>
+              <w:top w:type="dxa" w:w="60"/>
+              <w:left w:type="dxa" w:w="100"/>
+              <w:bottom w:type="dxa" w:w="60"/>
+              <w:right w:type="dxa" w:w="100"/>
+            </w:tcMar>
+          </w:tcPr>
+          <w:p>
+            <w:pPr>
+              <w:jc w:val="left"/>
+            </w:pPr>
+            <w:r>
+              <w:rPr>
+                <w:rFonts w:ascii="Arial" w:cs="Arial" w:eastAsia="Arial" w:hAnsi="Arial"/>
+                <w:b w:val="false"/>
+                <w:bCs w:val="false"/>
+                <w:sz w:val="20"/>
+                <w:szCs w:val="20"/>
+              </w:rPr>
+              <w:t xml:space="preserve">Search "4.7K 1/4W 1% metal film"</w:t>
+            </w:r>
+          </w:p>
+        </w:tc>
+        <w:tc>
+          <w:tcPr>
+            <w:tcW w:type="dxa" w:w="2760"/>
+            <w:tcBorders>
+              <w:top w:val="single" w:color="BBBBBB" w:sz="4"/>
+              <w:left w:val="single" w:color="BBBBBB" w:sz="4"/>
+              <w:bottom w:val="single" w:color="BBBBBB" w:sz="4"/>
+              <w:right w:val="single" w:color="BBBBBB" w:sz="4"/>
+            </w:tcBorders>
+            <w:tcMar>
+              <w:top w:type="dxa" w:w="60"/>
+              <w:left w:type="dxa" w:w="100"/>
+              <w:bottom w:type="dxa" w:w="60"/>
+              <w:right w:type="dxa" w:w="100"/>
+            </w:tcMar>
+          </w:tcPr>
+          <w:p>
+            <w:pPr>
+              <w:jc w:val="left"/>
+            </w:pPr>
+            <w:r>
+              <w:rPr>
+                <w:rFonts w:ascii="Arial" w:cs="Arial" w:eastAsia="Arial" w:hAnsi="Arial"/>
+                <w:b w:val="false"/>
+                <w:bCs w:val="false"/>
+                <w:sz w:val="20"/>
+                <w:szCs w:val="20"/>
+              </w:rPr>
+              <w:t xml:space="preserve">On/off LED resistor</w:t>
+            </w:r>
+          </w:p>
+        </w:tc>
+      </w:tr>
+      <w:tr>
+        <w:tc>
+          <w:tcPr>
             <w:tcW w:type="dxa" w:w="9360"/>
             <w:gridSpan w:val="5"/>
             <w:tcBorders>
@@ -4449,7 +4611,7 @@
                 <w:sz w:val="20"/>
                 <w:szCs w:val="20"/>
               </w:rPr>
-              <w:t xml:space="preserve">3</w:t>
+              <w:t xml:space="preserve">1</w:t>
             </w:r>
           </w:p>
         </w:tc>
@@ -4481,7 +4643,7 @@
                 <w:sz w:val="20"/>
                 <w:szCs w:val="20"/>
               </w:rPr>
-              <w:t xml:space="preserve">1/4" (6.35mm) mono jack</w:t>
+              <w:t xml:space="preserve">3PDT footswitch (latching, 9 lugs)</w:t>
             </w:r>
           </w:p>
         </w:tc>
@@ -4513,7 +4675,7 @@
                 <w:sz w:val="20"/>
                 <w:szCs w:val="20"/>
               </w:rPr>
-              <w:t xml:space="preserve">Search "6.35mm mono jack"</w:t>
+              <w:t xml:space="preserve">A-5509</w:t>
             </w:r>
           </w:p>
         </w:tc>
@@ -4545,7 +4707,7 @@
                 <w:sz w:val="20"/>
                 <w:szCs w:val="20"/>
               </w:rPr>
-              <w:t xml:space="preserve">Input, Output</w:t>
+              <w:t xml:space="preserve">On/off (true bypass)</w:t>
             </w:r>
           </w:p>
         </w:tc>
@@ -4611,7 +4773,7 @@
                 <w:sz w:val="20"/>
                 <w:szCs w:val="20"/>
               </w:rPr>
-              <w:t xml:space="preserve">2</w:t>
+              <w:t xml:space="preserve">5</w:t>
             </w:r>
           </w:p>
         </w:tc>
@@ -4643,7 +4805,7 @@
                 <w:sz w:val="20"/>
                 <w:szCs w:val="20"/>
               </w:rPr>
-              <w:t xml:space="preserve">2.1mm DC power jack</w:t>
+              <w:t xml:space="preserve">3mm red LED</w:t>
             </w:r>
           </w:p>
         </w:tc>
@@ -4675,7 +4837,7 @@
                 <w:sz w:val="20"/>
                 <w:szCs w:val="20"/>
               </w:rPr>
-              <w:t xml:space="preserve">Search "DC power jack 2.1mm"</w:t>
+              <w:t xml:space="preserve">A-261</w:t>
             </w:r>
           </w:p>
         </w:tc>
@@ -4707,7 +4869,7 @@
                 <w:sz w:val="20"/>
                 <w:szCs w:val="20"/>
               </w:rPr>
-              <w:t xml:space="preserve">Power (center negative)</w:t>
+              <w:t xml:space="preserve">On/off indicator</w:t>
             </w:r>
           </w:p>
         </w:tc>
@@ -4715,6 +4877,330 @@
       <w:tr>
         <w:tc>
           <w:tcPr>
+            <w:tcW w:type="dxa" w:w="700"/>
+            <w:tcBorders>
+              <w:top w:val="single" w:color="BBBBBB" w:sz="4"/>
+              <w:left w:val="single" w:color="BBBBBB" w:sz="4"/>
+              <w:bottom w:val="single" w:color="BBBBBB" w:sz="4"/>
+              <w:right w:val="single" w:color="BBBBBB" w:sz="4"/>
+            </w:tcBorders>
+            <w:tcMar>
+              <w:top w:type="dxa" w:w="60"/>
+              <w:left w:type="dxa" w:w="100"/>
+              <w:bottom w:type="dxa" w:w="60"/>
+              <w:right w:type="dxa" w:w="100"/>
+            </w:tcMar>
+          </w:tcPr>
+          <w:p>
+            <w:pPr>
+              <w:jc w:val="center"/>
+            </w:pPr>
+            <w:r>
+              <w:rPr>
+                <w:rFonts w:ascii="Arial" w:cs="Arial" w:eastAsia="Arial" w:hAnsi="Arial"/>
+                <w:b w:val="false"/>
+                <w:bCs w:val="false"/>
+                <w:sz w:val="20"/>
+                <w:szCs w:val="20"/>
+              </w:rPr>
+              <w:t xml:space="preserve">☐</w:t>
+            </w:r>
+          </w:p>
+        </w:tc>
+        <w:tc>
+          <w:tcPr>
+            <w:tcW w:type="dxa" w:w="600"/>
+            <w:tcBorders>
+              <w:top w:val="single" w:color="BBBBBB" w:sz="4"/>
+              <w:left w:val="single" w:color="BBBBBB" w:sz="4"/>
+              <w:bottom w:val="single" w:color="BBBBBB" w:sz="4"/>
+              <w:right w:val="single" w:color="BBBBBB" w:sz="4"/>
+            </w:tcBorders>
+            <w:tcMar>
+              <w:top w:type="dxa" w:w="60"/>
+              <w:left w:type="dxa" w:w="100"/>
+              <w:bottom w:type="dxa" w:w="60"/>
+              <w:right w:type="dxa" w:w="100"/>
+            </w:tcMar>
+          </w:tcPr>
+          <w:p>
+            <w:pPr>
+              <w:jc w:val="center"/>
+            </w:pPr>
+            <w:r>
+              <w:rPr>
+                <w:rFonts w:ascii="Arial" w:cs="Arial" w:eastAsia="Arial" w:hAnsi="Arial"/>
+                <w:b w:val="false"/>
+                <w:bCs w:val="false"/>
+                <w:sz w:val="20"/>
+                <w:szCs w:val="20"/>
+              </w:rPr>
+              <w:t xml:space="preserve">3</w:t>
+            </w:r>
+          </w:p>
+        </w:tc>
+        <w:tc>
+          <w:tcPr>
+            <w:tcW w:type="dxa" w:w="2700"/>
+            <w:tcBorders>
+              <w:top w:val="single" w:color="BBBBBB" w:sz="4"/>
+              <w:left w:val="single" w:color="BBBBBB" w:sz="4"/>
+              <w:bottom w:val="single" w:color="BBBBBB" w:sz="4"/>
+              <w:right w:val="single" w:color="BBBBBB" w:sz="4"/>
+            </w:tcBorders>
+            <w:tcMar>
+              <w:top w:type="dxa" w:w="60"/>
+              <w:left w:type="dxa" w:w="100"/>
+              <w:bottom w:type="dxa" w:w="60"/>
+              <w:right w:type="dxa" w:w="100"/>
+            </w:tcMar>
+          </w:tcPr>
+          <w:p>
+            <w:pPr>
+              <w:jc w:val="left"/>
+            </w:pPr>
+            <w:r>
+              <w:rPr>
+                <w:rFonts w:ascii="Arial" w:cs="Arial" w:eastAsia="Arial" w:hAnsi="Arial"/>
+                <w:b w:val="false"/>
+                <w:bCs w:val="false"/>
+                <w:sz w:val="20"/>
+                <w:szCs w:val="20"/>
+              </w:rPr>
+              <w:t xml:space="preserve">1/4" (6.35mm) mono jack</w:t>
+            </w:r>
+          </w:p>
+        </w:tc>
+        <w:tc>
+          <w:tcPr>
+            <w:tcW w:type="dxa" w:w="2600"/>
+            <w:tcBorders>
+              <w:top w:val="single" w:color="BBBBBB" w:sz="4"/>
+              <w:left w:val="single" w:color="BBBBBB" w:sz="4"/>
+              <w:bottom w:val="single" w:color="BBBBBB" w:sz="4"/>
+              <w:right w:val="single" w:color="BBBBBB" w:sz="4"/>
+            </w:tcBorders>
+            <w:tcMar>
+              <w:top w:type="dxa" w:w="60"/>
+              <w:left w:type="dxa" w:w="100"/>
+              <w:bottom w:type="dxa" w:w="60"/>
+              <w:right w:type="dxa" w:w="100"/>
+            </w:tcMar>
+          </w:tcPr>
+          <w:p>
+            <w:pPr>
+              <w:jc w:val="left"/>
+            </w:pPr>
+            <w:r>
+              <w:rPr>
+                <w:rFonts w:ascii="Arial" w:cs="Arial" w:eastAsia="Arial" w:hAnsi="Arial"/>
+                <w:b w:val="false"/>
+                <w:bCs w:val="false"/>
+                <w:sz w:val="20"/>
+                <w:szCs w:val="20"/>
+              </w:rPr>
+              <w:t xml:space="preserve">Search "6.35mm mono jack"</w:t>
+            </w:r>
+          </w:p>
+        </w:tc>
+        <w:tc>
+          <w:tcPr>
+            <w:tcW w:type="dxa" w:w="2760"/>
+            <w:tcBorders>
+              <w:top w:val="single" w:color="BBBBBB" w:sz="4"/>
+              <w:left w:val="single" w:color="BBBBBB" w:sz="4"/>
+              <w:bottom w:val="single" w:color="BBBBBB" w:sz="4"/>
+              <w:right w:val="single" w:color="BBBBBB" w:sz="4"/>
+            </w:tcBorders>
+            <w:tcMar>
+              <w:top w:type="dxa" w:w="60"/>
+              <w:left w:type="dxa" w:w="100"/>
+              <w:bottom w:type="dxa" w:w="60"/>
+              <w:right w:type="dxa" w:w="100"/>
+            </w:tcMar>
+          </w:tcPr>
+          <w:p>
+            <w:pPr>
+              <w:jc w:val="left"/>
+            </w:pPr>
+            <w:r>
+              <w:rPr>
+                <w:rFonts w:ascii="Arial" w:cs="Arial" w:eastAsia="Arial" w:hAnsi="Arial"/>
+                <w:b w:val="false"/>
+                <w:bCs w:val="false"/>
+                <w:sz w:val="20"/>
+                <w:szCs w:val="20"/>
+              </w:rPr>
+              <w:t xml:space="preserve">Input, Output</w:t>
+            </w:r>
+          </w:p>
+        </w:tc>
+      </w:tr>
+      <w:tr>
+        <w:tc>
+          <w:tcPr>
+            <w:tcW w:type="dxa" w:w="700"/>
+            <w:tcBorders>
+              <w:top w:val="single" w:color="BBBBBB" w:sz="4"/>
+              <w:left w:val="single" w:color="BBBBBB" w:sz="4"/>
+              <w:bottom w:val="single" w:color="BBBBBB" w:sz="4"/>
+              <w:right w:val="single" w:color="BBBBBB" w:sz="4"/>
+            </w:tcBorders>
+            <w:tcMar>
+              <w:top w:type="dxa" w:w="60"/>
+              <w:left w:type="dxa" w:w="100"/>
+              <w:bottom w:type="dxa" w:w="60"/>
+              <w:right w:type="dxa" w:w="100"/>
+            </w:tcMar>
+          </w:tcPr>
+          <w:p>
+            <w:pPr>
+              <w:jc w:val="center"/>
+            </w:pPr>
+            <w:r>
+              <w:rPr>
+                <w:rFonts w:ascii="Arial" w:cs="Arial" w:eastAsia="Arial" w:hAnsi="Arial"/>
+                <w:b w:val="false"/>
+                <w:bCs w:val="false"/>
+                <w:sz w:val="20"/>
+                <w:szCs w:val="20"/>
+              </w:rPr>
+              <w:t xml:space="preserve">☐</w:t>
+            </w:r>
+          </w:p>
+        </w:tc>
+        <w:tc>
+          <w:tcPr>
+            <w:tcW w:type="dxa" w:w="600"/>
+            <w:tcBorders>
+              <w:top w:val="single" w:color="BBBBBB" w:sz="4"/>
+              <w:left w:val="single" w:color="BBBBBB" w:sz="4"/>
+              <w:bottom w:val="single" w:color="BBBBBB" w:sz="4"/>
+              <w:right w:val="single" w:color="BBBBBB" w:sz="4"/>
+            </w:tcBorders>
+            <w:tcMar>
+              <w:top w:type="dxa" w:w="60"/>
+              <w:left w:type="dxa" w:w="100"/>
+              <w:bottom w:type="dxa" w:w="60"/>
+              <w:right w:type="dxa" w:w="100"/>
+            </w:tcMar>
+          </w:tcPr>
+          <w:p>
+            <w:pPr>
+              <w:jc w:val="center"/>
+            </w:pPr>
+            <w:r>
+              <w:rPr>
+                <w:rFonts w:ascii="Arial" w:cs="Arial" w:eastAsia="Arial" w:hAnsi="Arial"/>
+                <w:b w:val="false"/>
+                <w:bCs w:val="false"/>
+                <w:sz w:val="20"/>
+                <w:szCs w:val="20"/>
+              </w:rPr>
+              <w:t xml:space="preserve">2</w:t>
+            </w:r>
+          </w:p>
+        </w:tc>
+        <w:tc>
+          <w:tcPr>
+            <w:tcW w:type="dxa" w:w="2700"/>
+            <w:tcBorders>
+              <w:top w:val="single" w:color="BBBBBB" w:sz="4"/>
+              <w:left w:val="single" w:color="BBBBBB" w:sz="4"/>
+              <w:bottom w:val="single" w:color="BBBBBB" w:sz="4"/>
+              <w:right w:val="single" w:color="BBBBBB" w:sz="4"/>
+            </w:tcBorders>
+            <w:tcMar>
+              <w:top w:type="dxa" w:w="60"/>
+              <w:left w:type="dxa" w:w="100"/>
+              <w:bottom w:type="dxa" w:w="60"/>
+              <w:right w:type="dxa" w:w="100"/>
+            </w:tcMar>
+          </w:tcPr>
+          <w:p>
+            <w:pPr>
+              <w:jc w:val="left"/>
+            </w:pPr>
+            <w:r>
+              <w:rPr>
+                <w:rFonts w:ascii="Arial" w:cs="Arial" w:eastAsia="Arial" w:hAnsi="Arial"/>
+                <w:b w:val="false"/>
+                <w:bCs w:val="false"/>
+                <w:sz w:val="20"/>
+                <w:szCs w:val="20"/>
+              </w:rPr>
+              <w:t xml:space="preserve">2.1mm DC power jack</w:t>
+            </w:r>
+          </w:p>
+        </w:tc>
+        <w:tc>
+          <w:tcPr>
+            <w:tcW w:type="dxa" w:w="2600"/>
+            <w:tcBorders>
+              <w:top w:val="single" w:color="BBBBBB" w:sz="4"/>
+              <w:left w:val="single" w:color="BBBBBB" w:sz="4"/>
+              <w:bottom w:val="single" w:color="BBBBBB" w:sz="4"/>
+              <w:right w:val="single" w:color="BBBBBB" w:sz="4"/>
+            </w:tcBorders>
+            <w:tcMar>
+              <w:top w:type="dxa" w:w="60"/>
+              <w:left w:type="dxa" w:w="100"/>
+              <w:bottom w:type="dxa" w:w="60"/>
+              <w:right w:type="dxa" w:w="100"/>
+            </w:tcMar>
+          </w:tcPr>
+          <w:p>
+            <w:pPr>
+              <w:jc w:val="left"/>
+            </w:pPr>
+            <w:r>
+              <w:rPr>
+                <w:rFonts w:ascii="Arial" w:cs="Arial" w:eastAsia="Arial" w:hAnsi="Arial"/>
+                <w:b w:val="false"/>
+                <w:bCs w:val="false"/>
+                <w:sz w:val="20"/>
+                <w:szCs w:val="20"/>
+              </w:rPr>
+              <w:t xml:space="preserve">Search "DC power jack 2.1mm"</w:t>
+            </w:r>
+          </w:p>
+        </w:tc>
+        <w:tc>
+          <w:tcPr>
+            <w:tcW w:type="dxa" w:w="2760"/>
+            <w:tcBorders>
+              <w:top w:val="single" w:color="BBBBBB" w:sz="4"/>
+              <w:left w:val="single" w:color="BBBBBB" w:sz="4"/>
+              <w:bottom w:val="single" w:color="BBBBBB" w:sz="4"/>
+              <w:right w:val="single" w:color="BBBBBB" w:sz="4"/>
+            </w:tcBorders>
+            <w:tcMar>
+              <w:top w:type="dxa" w:w="60"/>
+              <w:left w:type="dxa" w:w="100"/>
+              <w:bottom w:type="dxa" w:w="60"/>
+              <w:right w:type="dxa" w:w="100"/>
+            </w:tcMar>
+          </w:tcPr>
+          <w:p>
+            <w:pPr>
+              <w:jc w:val="left"/>
+            </w:pPr>
+            <w:r>
+              <w:rPr>
+                <w:rFonts w:ascii="Arial" w:cs="Arial" w:eastAsia="Arial" w:hAnsi="Arial"/>
+                <w:b w:val="false"/>
+                <w:bCs w:val="false"/>
+                <w:sz w:val="20"/>
+                <w:szCs w:val="20"/>
+              </w:rPr>
+              <w:t xml:space="preserve">Power (center negative)</w:t>
+            </w:r>
+          </w:p>
+        </w:tc>
+      </w:tr>
+      <w:tr>
+        <w:tc>
+          <w:tcPr>
             <w:tcW w:type="dxa" w:w="9360"/>
             <w:gridSpan w:val="5"/>
             <w:tcBorders>
@@ -5389,6 +5875,201 @@
                 <w:szCs w:val="20"/>
               </w:rPr>
               <w:t xml:space="preserve"/>
+            </w:r>
+          </w:p>
+        </w:tc>
+      </w:tr>
+      <w:tr>
+        <w:tc>
+          <w:tcPr>
+            <w:tcW w:type="dxa" w:w="9360"/>
+            <w:gridSpan w:val="5"/>
+            <w:tcBorders>
+              <w:top w:val="single" w:color="BBBBBB" w:sz="4"/>
+              <w:left w:val="single" w:color="BBBBBB" w:sz="4"/>
+              <w:bottom w:val="single" w:color="BBBBBB" w:sz="4"/>
+              <w:right w:val="single" w:color="BBBBBB" w:sz="4"/>
+            </w:tcBorders>
+            <w:shd w:fill="F2F2F2" w:color="auto" w:val="clear"/>
+            <w:tcMar>
+              <w:top w:type="dxa" w:w="60"/>
+              <w:left w:type="dxa" w:w="100"/>
+              <w:bottom w:type="dxa" w:w="60"/>
+              <w:right w:type="dxa" w:w="100"/>
+            </w:tcMar>
+          </w:tcPr>
+          <w:p>
+            <w:r>
+              <w:rPr>
+                <w:rFonts w:ascii="Arial" w:cs="Arial" w:eastAsia="Arial" w:hAnsi="Arial"/>
+                <w:b/>
+                <w:bCs/>
+                <w:sz w:val="20"/>
+                <w:szCs w:val="20"/>
+              </w:rPr>
+              <w:t xml:space="preserve">Buy elsewhere (Tayda doesn’t sell these)</w:t>
+            </w:r>
+          </w:p>
+        </w:tc>
+      </w:tr>
+      <w:tr>
+        <w:tc>
+          <w:tcPr>
+            <w:tcW w:type="dxa" w:w="700"/>
+            <w:tcBorders>
+              <w:top w:val="single" w:color="BBBBBB" w:sz="4"/>
+              <w:left w:val="single" w:color="BBBBBB" w:sz="4"/>
+              <w:bottom w:val="single" w:color="BBBBBB" w:sz="4"/>
+              <w:right w:val="single" w:color="BBBBBB" w:sz="4"/>
+            </w:tcBorders>
+            <w:tcMar>
+              <w:top w:type="dxa" w:w="60"/>
+              <w:left w:type="dxa" w:w="100"/>
+              <w:bottom w:type="dxa" w:w="60"/>
+              <w:right w:type="dxa" w:w="100"/>
+            </w:tcMar>
+          </w:tcPr>
+          <w:p>
+            <w:pPr>
+              <w:jc w:val="center"/>
+            </w:pPr>
+            <w:r>
+              <w:rPr>
+                <w:rFonts w:ascii="Arial" w:cs="Arial" w:eastAsia="Arial" w:hAnsi="Arial"/>
+                <w:b w:val="false"/>
+                <w:bCs w:val="false"/>
+                <w:sz w:val="20"/>
+                <w:szCs w:val="20"/>
+              </w:rPr>
+              <w:t xml:space="preserve">☐</w:t>
+            </w:r>
+          </w:p>
+        </w:tc>
+        <w:tc>
+          <w:tcPr>
+            <w:tcW w:type="dxa" w:w="600"/>
+            <w:tcBorders>
+              <w:top w:val="single" w:color="BBBBBB" w:sz="4"/>
+              <w:left w:val="single" w:color="BBBBBB" w:sz="4"/>
+              <w:bottom w:val="single" w:color="BBBBBB" w:sz="4"/>
+              <w:right w:val="single" w:color="BBBBBB" w:sz="4"/>
+            </w:tcBorders>
+            <w:tcMar>
+              <w:top w:type="dxa" w:w="60"/>
+              <w:left w:type="dxa" w:w="100"/>
+              <w:bottom w:type="dxa" w:w="60"/>
+              <w:right w:type="dxa" w:w="100"/>
+            </w:tcMar>
+          </w:tcPr>
+          <w:p>
+            <w:pPr>
+              <w:jc w:val="center"/>
+            </w:pPr>
+            <w:r>
+              <w:rPr>
+                <w:rFonts w:ascii="Arial" w:cs="Arial" w:eastAsia="Arial" w:hAnsi="Arial"/>
+                <w:b w:val="false"/>
+                <w:bCs w:val="false"/>
+                <w:sz w:val="20"/>
+                <w:szCs w:val="20"/>
+              </w:rPr>
+              <w:t xml:space="preserve">1</w:t>
+            </w:r>
+          </w:p>
+        </w:tc>
+        <w:tc>
+          <w:tcPr>
+            <w:tcW w:type="dxa" w:w="2700"/>
+            <w:tcBorders>
+              <w:top w:val="single" w:color="BBBBBB" w:sz="4"/>
+              <w:left w:val="single" w:color="BBBBBB" w:sz="4"/>
+              <w:bottom w:val="single" w:color="BBBBBB" w:sz="4"/>
+              <w:right w:val="single" w:color="BBBBBB" w:sz="4"/>
+            </w:tcBorders>
+            <w:tcMar>
+              <w:top w:type="dxa" w:w="60"/>
+              <w:left w:type="dxa" w:w="100"/>
+              <w:bottom w:type="dxa" w:w="60"/>
+              <w:right w:type="dxa" w:w="100"/>
+            </w:tcMar>
+          </w:tcPr>
+          <w:p>
+            <w:pPr>
+              <w:jc w:val="left"/>
+            </w:pPr>
+            <w:r>
+              <w:rPr>
+                <w:rFonts w:ascii="Arial" w:cs="Arial" w:eastAsia="Arial" w:hAnsi="Arial"/>
+                <w:b w:val="false"/>
+                <w:bCs w:val="false"/>
+                <w:sz w:val="20"/>
+                <w:szCs w:val="20"/>
+              </w:rPr>
+              <w:t xml:space="preserve">Digital multimeter (auto-ranging, with continuity beep)</w:t>
+            </w:r>
+          </w:p>
+        </w:tc>
+        <w:tc>
+          <w:tcPr>
+            <w:tcW w:type="dxa" w:w="2600"/>
+            <w:tcBorders>
+              <w:top w:val="single" w:color="BBBBBB" w:sz="4"/>
+              <w:left w:val="single" w:color="BBBBBB" w:sz="4"/>
+              <w:bottom w:val="single" w:color="BBBBBB" w:sz="4"/>
+              <w:right w:val="single" w:color="BBBBBB" w:sz="4"/>
+            </w:tcBorders>
+            <w:tcMar>
+              <w:top w:type="dxa" w:w="60"/>
+              <w:left w:type="dxa" w:w="100"/>
+              <w:bottom w:type="dxa" w:w="60"/>
+              <w:right w:type="dxa" w:w="100"/>
+            </w:tcMar>
+          </w:tcPr>
+          <w:p>
+            <w:pPr>
+              <w:jc w:val="left"/>
+            </w:pPr>
+            <w:r>
+              <w:rPr>
+                <w:rFonts w:ascii="Arial" w:cs="Arial" w:eastAsia="Arial" w:hAnsi="Arial"/>
+                <w:b w:val="false"/>
+                <w:bCs w:val="false"/>
+                <w:sz w:val="20"/>
+                <w:szCs w:val="20"/>
+              </w:rPr>
+              <w:t xml:space="preserve">Amazon or a local store, about $15–30</w:t>
+            </w:r>
+          </w:p>
+        </w:tc>
+        <w:tc>
+          <w:tcPr>
+            <w:tcW w:type="dxa" w:w="2760"/>
+            <w:tcBorders>
+              <w:top w:val="single" w:color="BBBBBB" w:sz="4"/>
+              <w:left w:val="single" w:color="BBBBBB" w:sz="4"/>
+              <w:bottom w:val="single" w:color="BBBBBB" w:sz="4"/>
+              <w:right w:val="single" w:color="BBBBBB" w:sz="4"/>
+            </w:tcBorders>
+            <w:tcMar>
+              <w:top w:type="dxa" w:w="60"/>
+              <w:left w:type="dxa" w:w="100"/>
+              <w:bottom w:type="dxa" w:w="60"/>
+              <w:right w:type="dxa" w:w="100"/>
+            </w:tcMar>
+          </w:tcPr>
+          <w:p>
+            <w:pPr>
+              <w:jc w:val="left"/>
+            </w:pPr>
+            <w:r>
+              <w:rPr>
+                <w:rFonts w:ascii="Arial" w:cs="Arial" w:eastAsia="Arial" w:hAnsi="Arial"/>
+                <w:b w:val="false"/>
+                <w:bCs w:val="false"/>
+                <w:sz w:val="20"/>
+                <w:szCs w:val="20"/>
+              </w:rPr>
+              <w:t xml:space="preserve">The voltage checks in each build step</w:t>
             </w:r>
           </w:p>
         </w:tc>
@@ -5427,6 +6108,24 @@
           <w:szCs w:val="22"/>
         </w:rPr>
         <w:t xml:space="preserve">Quantities include spares. Resistors come in packs of 10.</w:t>
+      </w:r>
+    </w:p>
+    <w:p>
+      <w:pPr>
+        <w:pStyle w:val="ListParagraph"/>
+        <w:numPr>
+          <w:ilvl w:val="0"/>
+          <w:numId w:val="2"/>
+        </w:numPr>
+        <w:spacing w:after="80"/>
+      </w:pPr>
+      <w:r>
+        <w:rPr>
+          <w:rFonts w:ascii="Arial" w:cs="Arial" w:eastAsia="Arial" w:hAnsi="Arial"/>
+          <w:sz w:val="22"/>
+          <w:szCs w:val="22"/>
+        </w:rPr>
+        <w:t xml:space="preserve">The footswitch’s lugs need wires soldered on (9 lugs), so a soldering iron is needed for it.</w:t>
       </w:r>
     </w:p>
     <w:p>

</xml_diff>

<commit_message>
Add optional clipping test diodes to the Flashover Tayda order
Adds 1N60, BAT46, 1N4001, 1N5817 and red LED pairs for swapping into
the Soft/Hard clipping positions, with a note on fitting them and
matching volume before comparing.

Co-Authored-By: Claude Opus 5.5 <noreply@anthropic.com>
</commit_message>
<xml_diff>
--- a/pedals/distortion/Flashover Breadboard Tayda Order.docx
+++ b/pedals/distortion/Flashover Breadboard Tayda Order.docx
@@ -1239,6 +1239,849 @@
                 <w:sz w:val="20"/>
                 <w:szCs w:val="20"/>
               </w:rPr>
+              <w:t xml:space="preserve">Clipping test diodes (optional)</w:t>
+            </w:r>
+          </w:p>
+        </w:tc>
+      </w:tr>
+      <w:tr>
+        <w:tc>
+          <w:tcPr>
+            <w:tcW w:type="dxa" w:w="700"/>
+            <w:tcBorders>
+              <w:top w:val="single" w:color="BBBBBB" w:sz="4"/>
+              <w:left w:val="single" w:color="BBBBBB" w:sz="4"/>
+              <w:bottom w:val="single" w:color="BBBBBB" w:sz="4"/>
+              <w:right w:val="single" w:color="BBBBBB" w:sz="4"/>
+            </w:tcBorders>
+            <w:tcMar>
+              <w:top w:type="dxa" w:w="60"/>
+              <w:left w:type="dxa" w:w="100"/>
+              <w:bottom w:type="dxa" w:w="60"/>
+              <w:right w:type="dxa" w:w="100"/>
+            </w:tcMar>
+          </w:tcPr>
+          <w:p>
+            <w:pPr>
+              <w:jc w:val="center"/>
+            </w:pPr>
+            <w:r>
+              <w:rPr>
+                <w:rFonts w:ascii="Arial" w:cs="Arial" w:eastAsia="Arial" w:hAnsi="Arial"/>
+                <w:b w:val="false"/>
+                <w:bCs w:val="false"/>
+                <w:sz w:val="20"/>
+                <w:szCs w:val="20"/>
+              </w:rPr>
+              <w:t xml:space="preserve">☐</w:t>
+            </w:r>
+          </w:p>
+        </w:tc>
+        <w:tc>
+          <w:tcPr>
+            <w:tcW w:type="dxa" w:w="600"/>
+            <w:tcBorders>
+              <w:top w:val="single" w:color="BBBBBB" w:sz="4"/>
+              <w:left w:val="single" w:color="BBBBBB" w:sz="4"/>
+              <w:bottom w:val="single" w:color="BBBBBB" w:sz="4"/>
+              <w:right w:val="single" w:color="BBBBBB" w:sz="4"/>
+            </w:tcBorders>
+            <w:tcMar>
+              <w:top w:type="dxa" w:w="60"/>
+              <w:left w:type="dxa" w:w="100"/>
+              <w:bottom w:type="dxa" w:w="60"/>
+              <w:right w:type="dxa" w:w="100"/>
+            </w:tcMar>
+          </w:tcPr>
+          <w:p>
+            <w:pPr>
+              <w:jc w:val="center"/>
+            </w:pPr>
+            <w:r>
+              <w:rPr>
+                <w:rFonts w:ascii="Arial" w:cs="Arial" w:eastAsia="Arial" w:hAnsi="Arial"/>
+                <w:b w:val="false"/>
+                <w:bCs w:val="false"/>
+                <w:sz w:val="20"/>
+                <w:szCs w:val="20"/>
+              </w:rPr>
+              <w:t xml:space="preserve">4</w:t>
+            </w:r>
+          </w:p>
+        </w:tc>
+        <w:tc>
+          <w:tcPr>
+            <w:tcW w:type="dxa" w:w="2700"/>
+            <w:tcBorders>
+              <w:top w:val="single" w:color="BBBBBB" w:sz="4"/>
+              <w:left w:val="single" w:color="BBBBBB" w:sz="4"/>
+              <w:bottom w:val="single" w:color="BBBBBB" w:sz="4"/>
+              <w:right w:val="single" w:color="BBBBBB" w:sz="4"/>
+            </w:tcBorders>
+            <w:tcMar>
+              <w:top w:type="dxa" w:w="60"/>
+              <w:left w:type="dxa" w:w="100"/>
+              <w:bottom w:type="dxa" w:w="60"/>
+              <w:right w:type="dxa" w:w="100"/>
+            </w:tcMar>
+          </w:tcPr>
+          <w:p>
+            <w:pPr>
+              <w:jc w:val="left"/>
+            </w:pPr>
+            <w:r>
+              <w:rPr>
+                <w:rFonts w:ascii="Arial" w:cs="Arial" w:eastAsia="Arial" w:hAnsi="Arial"/>
+                <w:b w:val="false"/>
+                <w:bCs w:val="false"/>
+                <w:sz w:val="20"/>
+                <w:szCs w:val="20"/>
+              </w:rPr>
+              <w:t xml:space="preserve">1N60 germanium diode</w:t>
+            </w:r>
+          </w:p>
+        </w:tc>
+        <w:tc>
+          <w:tcPr>
+            <w:tcW w:type="dxa" w:w="2600"/>
+            <w:tcBorders>
+              <w:top w:val="single" w:color="BBBBBB" w:sz="4"/>
+              <w:left w:val="single" w:color="BBBBBB" w:sz="4"/>
+              <w:bottom w:val="single" w:color="BBBBBB" w:sz="4"/>
+              <w:right w:val="single" w:color="BBBBBB" w:sz="4"/>
+            </w:tcBorders>
+            <w:tcMar>
+              <w:top w:type="dxa" w:w="60"/>
+              <w:left w:type="dxa" w:w="100"/>
+              <w:bottom w:type="dxa" w:w="60"/>
+              <w:right w:type="dxa" w:w="100"/>
+            </w:tcMar>
+          </w:tcPr>
+          <w:p>
+            <w:pPr>
+              <w:jc w:val="left"/>
+            </w:pPr>
+            <w:r>
+              <w:rPr>
+                <w:rFonts w:ascii="Arial" w:cs="Arial" w:eastAsia="Arial" w:hAnsi="Arial"/>
+                <w:b w:val="false"/>
+                <w:bCs w:val="false"/>
+                <w:sz w:val="20"/>
+                <w:szCs w:val="20"/>
+              </w:rPr>
+              <w:t xml:space="preserve">Search "1N60"</w:t>
+            </w:r>
+          </w:p>
+        </w:tc>
+        <w:tc>
+          <w:tcPr>
+            <w:tcW w:type="dxa" w:w="2760"/>
+            <w:tcBorders>
+              <w:top w:val="single" w:color="BBBBBB" w:sz="4"/>
+              <w:left w:val="single" w:color="BBBBBB" w:sz="4"/>
+              <w:bottom w:val="single" w:color="BBBBBB" w:sz="4"/>
+              <w:right w:val="single" w:color="BBBBBB" w:sz="4"/>
+            </w:tcBorders>
+            <w:tcMar>
+              <w:top w:type="dxa" w:w="60"/>
+              <w:left w:type="dxa" w:w="100"/>
+              <w:bottom w:type="dxa" w:w="60"/>
+              <w:right w:type="dxa" w:w="100"/>
+            </w:tcMar>
+          </w:tcPr>
+          <w:p>
+            <w:pPr>
+              <w:jc w:val="left"/>
+            </w:pPr>
+            <w:r>
+              <w:rPr>
+                <w:rFonts w:ascii="Arial" w:cs="Arial" w:eastAsia="Arial" w:hAnsi="Arial"/>
+                <w:b w:val="false"/>
+                <w:bCs w:val="false"/>
+                <w:sz w:val="20"/>
+                <w:szCs w:val="20"/>
+              </w:rPr>
+              <w:t xml:space="preserve">Germanium alternative, and a backup if the 1N34A is out of stock</w:t>
+            </w:r>
+          </w:p>
+        </w:tc>
+      </w:tr>
+      <w:tr>
+        <w:tc>
+          <w:tcPr>
+            <w:tcW w:type="dxa" w:w="700"/>
+            <w:tcBorders>
+              <w:top w:val="single" w:color="BBBBBB" w:sz="4"/>
+              <w:left w:val="single" w:color="BBBBBB" w:sz="4"/>
+              <w:bottom w:val="single" w:color="BBBBBB" w:sz="4"/>
+              <w:right w:val="single" w:color="BBBBBB" w:sz="4"/>
+            </w:tcBorders>
+            <w:tcMar>
+              <w:top w:type="dxa" w:w="60"/>
+              <w:left w:type="dxa" w:w="100"/>
+              <w:bottom w:type="dxa" w:w="60"/>
+              <w:right w:type="dxa" w:w="100"/>
+            </w:tcMar>
+          </w:tcPr>
+          <w:p>
+            <w:pPr>
+              <w:jc w:val="center"/>
+            </w:pPr>
+            <w:r>
+              <w:rPr>
+                <w:rFonts w:ascii="Arial" w:cs="Arial" w:eastAsia="Arial" w:hAnsi="Arial"/>
+                <w:b w:val="false"/>
+                <w:bCs w:val="false"/>
+                <w:sz w:val="20"/>
+                <w:szCs w:val="20"/>
+              </w:rPr>
+              <w:t xml:space="preserve">☐</w:t>
+            </w:r>
+          </w:p>
+        </w:tc>
+        <w:tc>
+          <w:tcPr>
+            <w:tcW w:type="dxa" w:w="600"/>
+            <w:tcBorders>
+              <w:top w:val="single" w:color="BBBBBB" w:sz="4"/>
+              <w:left w:val="single" w:color="BBBBBB" w:sz="4"/>
+              <w:bottom w:val="single" w:color="BBBBBB" w:sz="4"/>
+              <w:right w:val="single" w:color="BBBBBB" w:sz="4"/>
+            </w:tcBorders>
+            <w:tcMar>
+              <w:top w:type="dxa" w:w="60"/>
+              <w:left w:type="dxa" w:w="100"/>
+              <w:bottom w:type="dxa" w:w="60"/>
+              <w:right w:type="dxa" w:w="100"/>
+            </w:tcMar>
+          </w:tcPr>
+          <w:p>
+            <w:pPr>
+              <w:jc w:val="center"/>
+            </w:pPr>
+            <w:r>
+              <w:rPr>
+                <w:rFonts w:ascii="Arial" w:cs="Arial" w:eastAsia="Arial" w:hAnsi="Arial"/>
+                <w:b w:val="false"/>
+                <w:bCs w:val="false"/>
+                <w:sz w:val="20"/>
+                <w:szCs w:val="20"/>
+              </w:rPr>
+              <w:t xml:space="preserve">4</w:t>
+            </w:r>
+          </w:p>
+        </w:tc>
+        <w:tc>
+          <w:tcPr>
+            <w:tcW w:type="dxa" w:w="2700"/>
+            <w:tcBorders>
+              <w:top w:val="single" w:color="BBBBBB" w:sz="4"/>
+              <w:left w:val="single" w:color="BBBBBB" w:sz="4"/>
+              <w:bottom w:val="single" w:color="BBBBBB" w:sz="4"/>
+              <w:right w:val="single" w:color="BBBBBB" w:sz="4"/>
+            </w:tcBorders>
+            <w:tcMar>
+              <w:top w:type="dxa" w:w="60"/>
+              <w:left w:type="dxa" w:w="100"/>
+              <w:bottom w:type="dxa" w:w="60"/>
+              <w:right w:type="dxa" w:w="100"/>
+            </w:tcMar>
+          </w:tcPr>
+          <w:p>
+            <w:pPr>
+              <w:jc w:val="left"/>
+            </w:pPr>
+            <w:r>
+              <w:rPr>
+                <w:rFonts w:ascii="Arial" w:cs="Arial" w:eastAsia="Arial" w:hAnsi="Arial"/>
+                <w:b w:val="false"/>
+                <w:bCs w:val="false"/>
+                <w:sz w:val="20"/>
+                <w:szCs w:val="20"/>
+              </w:rPr>
+              <w:t xml:space="preserve">BAT46 Schottky diode</w:t>
+            </w:r>
+          </w:p>
+        </w:tc>
+        <w:tc>
+          <w:tcPr>
+            <w:tcW w:type="dxa" w:w="2600"/>
+            <w:tcBorders>
+              <w:top w:val="single" w:color="BBBBBB" w:sz="4"/>
+              <w:left w:val="single" w:color="BBBBBB" w:sz="4"/>
+              <w:bottom w:val="single" w:color="BBBBBB" w:sz="4"/>
+              <w:right w:val="single" w:color="BBBBBB" w:sz="4"/>
+            </w:tcBorders>
+            <w:tcMar>
+              <w:top w:type="dxa" w:w="60"/>
+              <w:left w:type="dxa" w:w="100"/>
+              <w:bottom w:type="dxa" w:w="60"/>
+              <w:right w:type="dxa" w:w="100"/>
+            </w:tcMar>
+          </w:tcPr>
+          <w:p>
+            <w:pPr>
+              <w:jc w:val="left"/>
+            </w:pPr>
+            <w:r>
+              <w:rPr>
+                <w:rFonts w:ascii="Arial" w:cs="Arial" w:eastAsia="Arial" w:hAnsi="Arial"/>
+                <w:b w:val="false"/>
+                <w:bCs w:val="false"/>
+                <w:sz w:val="20"/>
+                <w:szCs w:val="20"/>
+              </w:rPr>
+              <w:t xml:space="preserve">Search "BAT46"</w:t>
+            </w:r>
+          </w:p>
+        </w:tc>
+        <w:tc>
+          <w:tcPr>
+            <w:tcW w:type="dxa" w:w="2760"/>
+            <w:tcBorders>
+              <w:top w:val="single" w:color="BBBBBB" w:sz="4"/>
+              <w:left w:val="single" w:color="BBBBBB" w:sz="4"/>
+              <w:bottom w:val="single" w:color="BBBBBB" w:sz="4"/>
+              <w:right w:val="single" w:color="BBBBBB" w:sz="4"/>
+            </w:tcBorders>
+            <w:tcMar>
+              <w:top w:type="dxa" w:w="60"/>
+              <w:left w:type="dxa" w:w="100"/>
+              <w:bottom w:type="dxa" w:w="60"/>
+              <w:right w:type="dxa" w:w="100"/>
+            </w:tcMar>
+          </w:tcPr>
+          <w:p>
+            <w:pPr>
+              <w:jc w:val="left"/>
+            </w:pPr>
+            <w:r>
+              <w:rPr>
+                <w:rFonts w:ascii="Arial" w:cs="Arial" w:eastAsia="Arial" w:hAnsi="Arial"/>
+                <w:b w:val="false"/>
+                <w:bCs w:val="false"/>
+                <w:sz w:val="20"/>
+                <w:szCs w:val="20"/>
+              </w:rPr>
+              <w:t xml:space="preserve">Clips between germanium and silicon</w:t>
+            </w:r>
+          </w:p>
+        </w:tc>
+      </w:tr>
+      <w:tr>
+        <w:tc>
+          <w:tcPr>
+            <w:tcW w:type="dxa" w:w="700"/>
+            <w:tcBorders>
+              <w:top w:val="single" w:color="BBBBBB" w:sz="4"/>
+              <w:left w:val="single" w:color="BBBBBB" w:sz="4"/>
+              <w:bottom w:val="single" w:color="BBBBBB" w:sz="4"/>
+              <w:right w:val="single" w:color="BBBBBB" w:sz="4"/>
+            </w:tcBorders>
+            <w:tcMar>
+              <w:top w:type="dxa" w:w="60"/>
+              <w:left w:type="dxa" w:w="100"/>
+              <w:bottom w:type="dxa" w:w="60"/>
+              <w:right w:type="dxa" w:w="100"/>
+            </w:tcMar>
+          </w:tcPr>
+          <w:p>
+            <w:pPr>
+              <w:jc w:val="center"/>
+            </w:pPr>
+            <w:r>
+              <w:rPr>
+                <w:rFonts w:ascii="Arial" w:cs="Arial" w:eastAsia="Arial" w:hAnsi="Arial"/>
+                <w:b w:val="false"/>
+                <w:bCs w:val="false"/>
+                <w:sz w:val="20"/>
+                <w:szCs w:val="20"/>
+              </w:rPr>
+              <w:t xml:space="preserve">☐</w:t>
+            </w:r>
+          </w:p>
+        </w:tc>
+        <w:tc>
+          <w:tcPr>
+            <w:tcW w:type="dxa" w:w="600"/>
+            <w:tcBorders>
+              <w:top w:val="single" w:color="BBBBBB" w:sz="4"/>
+              <w:left w:val="single" w:color="BBBBBB" w:sz="4"/>
+              <w:bottom w:val="single" w:color="BBBBBB" w:sz="4"/>
+              <w:right w:val="single" w:color="BBBBBB" w:sz="4"/>
+            </w:tcBorders>
+            <w:tcMar>
+              <w:top w:type="dxa" w:w="60"/>
+              <w:left w:type="dxa" w:w="100"/>
+              <w:bottom w:type="dxa" w:w="60"/>
+              <w:right w:type="dxa" w:w="100"/>
+            </w:tcMar>
+          </w:tcPr>
+          <w:p>
+            <w:pPr>
+              <w:jc w:val="center"/>
+            </w:pPr>
+            <w:r>
+              <w:rPr>
+                <w:rFonts w:ascii="Arial" w:cs="Arial" w:eastAsia="Arial" w:hAnsi="Arial"/>
+                <w:b w:val="false"/>
+                <w:bCs w:val="false"/>
+                <w:sz w:val="20"/>
+                <w:szCs w:val="20"/>
+              </w:rPr>
+              <w:t xml:space="preserve">4</w:t>
+            </w:r>
+          </w:p>
+        </w:tc>
+        <w:tc>
+          <w:tcPr>
+            <w:tcW w:type="dxa" w:w="2700"/>
+            <w:tcBorders>
+              <w:top w:val="single" w:color="BBBBBB" w:sz="4"/>
+              <w:left w:val="single" w:color="BBBBBB" w:sz="4"/>
+              <w:bottom w:val="single" w:color="BBBBBB" w:sz="4"/>
+              <w:right w:val="single" w:color="BBBBBB" w:sz="4"/>
+            </w:tcBorders>
+            <w:tcMar>
+              <w:top w:type="dxa" w:w="60"/>
+              <w:left w:type="dxa" w:w="100"/>
+              <w:bottom w:type="dxa" w:w="60"/>
+              <w:right w:type="dxa" w:w="100"/>
+            </w:tcMar>
+          </w:tcPr>
+          <w:p>
+            <w:pPr>
+              <w:jc w:val="left"/>
+            </w:pPr>
+            <w:r>
+              <w:rPr>
+                <w:rFonts w:ascii="Arial" w:cs="Arial" w:eastAsia="Arial" w:hAnsi="Arial"/>
+                <w:b w:val="false"/>
+                <w:bCs w:val="false"/>
+                <w:sz w:val="20"/>
+                <w:szCs w:val="20"/>
+              </w:rPr>
+              <w:t xml:space="preserve">1N4001 silicon diode</w:t>
+            </w:r>
+          </w:p>
+        </w:tc>
+        <w:tc>
+          <w:tcPr>
+            <w:tcW w:type="dxa" w:w="2600"/>
+            <w:tcBorders>
+              <w:top w:val="single" w:color="BBBBBB" w:sz="4"/>
+              <w:left w:val="single" w:color="BBBBBB" w:sz="4"/>
+              <w:bottom w:val="single" w:color="BBBBBB" w:sz="4"/>
+              <w:right w:val="single" w:color="BBBBBB" w:sz="4"/>
+            </w:tcBorders>
+            <w:tcMar>
+              <w:top w:type="dxa" w:w="60"/>
+              <w:left w:type="dxa" w:w="100"/>
+              <w:bottom w:type="dxa" w:w="60"/>
+              <w:right w:type="dxa" w:w="100"/>
+            </w:tcMar>
+          </w:tcPr>
+          <w:p>
+            <w:pPr>
+              <w:jc w:val="left"/>
+            </w:pPr>
+            <w:r>
+              <w:rPr>
+                <w:rFonts w:ascii="Arial" w:cs="Arial" w:eastAsia="Arial" w:hAnsi="Arial"/>
+                <w:b w:val="false"/>
+                <w:bCs w:val="false"/>
+                <w:sz w:val="20"/>
+                <w:szCs w:val="20"/>
+              </w:rPr>
+              <w:t xml:space="preserve">Search "1N4001"</w:t>
+            </w:r>
+          </w:p>
+        </w:tc>
+        <w:tc>
+          <w:tcPr>
+            <w:tcW w:type="dxa" w:w="2760"/>
+            <w:tcBorders>
+              <w:top w:val="single" w:color="BBBBBB" w:sz="4"/>
+              <w:left w:val="single" w:color="BBBBBB" w:sz="4"/>
+              <w:bottom w:val="single" w:color="BBBBBB" w:sz="4"/>
+              <w:right w:val="single" w:color="BBBBBB" w:sz="4"/>
+            </w:tcBorders>
+            <w:tcMar>
+              <w:top w:type="dxa" w:w="60"/>
+              <w:left w:type="dxa" w:w="100"/>
+              <w:bottom w:type="dxa" w:w="60"/>
+              <w:right w:type="dxa" w:w="100"/>
+            </w:tcMar>
+          </w:tcPr>
+          <w:p>
+            <w:pPr>
+              <w:jc w:val="left"/>
+            </w:pPr>
+            <w:r>
+              <w:rPr>
+                <w:rFonts w:ascii="Arial" w:cs="Arial" w:eastAsia="Arial" w:hAnsi="Arial"/>
+                <w:b w:val="false"/>
+                <w:bCs w:val="false"/>
+                <w:sz w:val="20"/>
+                <w:szCs w:val="20"/>
+              </w:rPr>
+              <w:t xml:space="preserve">A slightly smoother silicon clip than the 1N4148</w:t>
+            </w:r>
+          </w:p>
+        </w:tc>
+      </w:tr>
+      <w:tr>
+        <w:tc>
+          <w:tcPr>
+            <w:tcW w:type="dxa" w:w="700"/>
+            <w:tcBorders>
+              <w:top w:val="single" w:color="BBBBBB" w:sz="4"/>
+              <w:left w:val="single" w:color="BBBBBB" w:sz="4"/>
+              <w:bottom w:val="single" w:color="BBBBBB" w:sz="4"/>
+              <w:right w:val="single" w:color="BBBBBB" w:sz="4"/>
+            </w:tcBorders>
+            <w:tcMar>
+              <w:top w:type="dxa" w:w="60"/>
+              <w:left w:type="dxa" w:w="100"/>
+              <w:bottom w:type="dxa" w:w="60"/>
+              <w:right w:type="dxa" w:w="100"/>
+            </w:tcMar>
+          </w:tcPr>
+          <w:p>
+            <w:pPr>
+              <w:jc w:val="center"/>
+            </w:pPr>
+            <w:r>
+              <w:rPr>
+                <w:rFonts w:ascii="Arial" w:cs="Arial" w:eastAsia="Arial" w:hAnsi="Arial"/>
+                <w:b w:val="false"/>
+                <w:bCs w:val="false"/>
+                <w:sz w:val="20"/>
+                <w:szCs w:val="20"/>
+              </w:rPr>
+              <w:t xml:space="preserve">☐</w:t>
+            </w:r>
+          </w:p>
+        </w:tc>
+        <w:tc>
+          <w:tcPr>
+            <w:tcW w:type="dxa" w:w="600"/>
+            <w:tcBorders>
+              <w:top w:val="single" w:color="BBBBBB" w:sz="4"/>
+              <w:left w:val="single" w:color="BBBBBB" w:sz="4"/>
+              <w:bottom w:val="single" w:color="BBBBBB" w:sz="4"/>
+              <w:right w:val="single" w:color="BBBBBB" w:sz="4"/>
+            </w:tcBorders>
+            <w:tcMar>
+              <w:top w:type="dxa" w:w="60"/>
+              <w:left w:type="dxa" w:w="100"/>
+              <w:bottom w:type="dxa" w:w="60"/>
+              <w:right w:type="dxa" w:w="100"/>
+            </w:tcMar>
+          </w:tcPr>
+          <w:p>
+            <w:pPr>
+              <w:jc w:val="center"/>
+            </w:pPr>
+            <w:r>
+              <w:rPr>
+                <w:rFonts w:ascii="Arial" w:cs="Arial" w:eastAsia="Arial" w:hAnsi="Arial"/>
+                <w:b w:val="false"/>
+                <w:bCs w:val="false"/>
+                <w:sz w:val="20"/>
+                <w:szCs w:val="20"/>
+              </w:rPr>
+              <w:t xml:space="preserve">2</w:t>
+            </w:r>
+          </w:p>
+        </w:tc>
+        <w:tc>
+          <w:tcPr>
+            <w:tcW w:type="dxa" w:w="2700"/>
+            <w:tcBorders>
+              <w:top w:val="single" w:color="BBBBBB" w:sz="4"/>
+              <w:left w:val="single" w:color="BBBBBB" w:sz="4"/>
+              <w:bottom w:val="single" w:color="BBBBBB" w:sz="4"/>
+              <w:right w:val="single" w:color="BBBBBB" w:sz="4"/>
+            </w:tcBorders>
+            <w:tcMar>
+              <w:top w:type="dxa" w:w="60"/>
+              <w:left w:type="dxa" w:w="100"/>
+              <w:bottom w:type="dxa" w:w="60"/>
+              <w:right w:type="dxa" w:w="100"/>
+            </w:tcMar>
+          </w:tcPr>
+          <w:p>
+            <w:pPr>
+              <w:jc w:val="left"/>
+            </w:pPr>
+            <w:r>
+              <w:rPr>
+                <w:rFonts w:ascii="Arial" w:cs="Arial" w:eastAsia="Arial" w:hAnsi="Arial"/>
+                <w:b w:val="false"/>
+                <w:bCs w:val="false"/>
+                <w:sz w:val="20"/>
+                <w:szCs w:val="20"/>
+              </w:rPr>
+              <w:t xml:space="preserve">1N5817 Schottky diode</w:t>
+            </w:r>
+          </w:p>
+        </w:tc>
+        <w:tc>
+          <w:tcPr>
+            <w:tcW w:type="dxa" w:w="2600"/>
+            <w:tcBorders>
+              <w:top w:val="single" w:color="BBBBBB" w:sz="4"/>
+              <w:left w:val="single" w:color="BBBBBB" w:sz="4"/>
+              <w:bottom w:val="single" w:color="BBBBBB" w:sz="4"/>
+              <w:right w:val="single" w:color="BBBBBB" w:sz="4"/>
+            </w:tcBorders>
+            <w:tcMar>
+              <w:top w:type="dxa" w:w="60"/>
+              <w:left w:type="dxa" w:w="100"/>
+              <w:bottom w:type="dxa" w:w="60"/>
+              <w:right w:type="dxa" w:w="100"/>
+            </w:tcMar>
+          </w:tcPr>
+          <w:p>
+            <w:pPr>
+              <w:jc w:val="left"/>
+            </w:pPr>
+            <w:r>
+              <w:rPr>
+                <w:rFonts w:ascii="Arial" w:cs="Arial" w:eastAsia="Arial" w:hAnsi="Arial"/>
+                <w:b w:val="false"/>
+                <w:bCs w:val="false"/>
+                <w:sz w:val="20"/>
+                <w:szCs w:val="20"/>
+              </w:rPr>
+              <w:t xml:space="preserve">A-159</w:t>
+            </w:r>
+          </w:p>
+        </w:tc>
+        <w:tc>
+          <w:tcPr>
+            <w:tcW w:type="dxa" w:w="2760"/>
+            <w:tcBorders>
+              <w:top w:val="single" w:color="BBBBBB" w:sz="4"/>
+              <w:left w:val="single" w:color="BBBBBB" w:sz="4"/>
+              <w:bottom w:val="single" w:color="BBBBBB" w:sz="4"/>
+              <w:right w:val="single" w:color="BBBBBB" w:sz="4"/>
+            </w:tcBorders>
+            <w:tcMar>
+              <w:top w:type="dxa" w:w="60"/>
+              <w:left w:type="dxa" w:w="100"/>
+              <w:bottom w:type="dxa" w:w="60"/>
+              <w:right w:type="dxa" w:w="100"/>
+            </w:tcMar>
+          </w:tcPr>
+          <w:p>
+            <w:pPr>
+              <w:jc w:val="left"/>
+            </w:pPr>
+            <w:r>
+              <w:rPr>
+                <w:rFonts w:ascii="Arial" w:cs="Arial" w:eastAsia="Arial" w:hAnsi="Arial"/>
+                <w:b w:val="false"/>
+                <w:bCs w:val="false"/>
+                <w:sz w:val="20"/>
+                <w:szCs w:val="20"/>
+              </w:rPr>
+              <w:t xml:space="preserve">A Schottky pair, plus the spare from the D3 row</w:t>
+            </w:r>
+          </w:p>
+        </w:tc>
+      </w:tr>
+      <w:tr>
+        <w:tc>
+          <w:tcPr>
+            <w:tcW w:type="dxa" w:w="700"/>
+            <w:tcBorders>
+              <w:top w:val="single" w:color="BBBBBB" w:sz="4"/>
+              <w:left w:val="single" w:color="BBBBBB" w:sz="4"/>
+              <w:bottom w:val="single" w:color="BBBBBB" w:sz="4"/>
+              <w:right w:val="single" w:color="BBBBBB" w:sz="4"/>
+            </w:tcBorders>
+            <w:tcMar>
+              <w:top w:type="dxa" w:w="60"/>
+              <w:left w:type="dxa" w:w="100"/>
+              <w:bottom w:type="dxa" w:w="60"/>
+              <w:right w:type="dxa" w:w="100"/>
+            </w:tcMar>
+          </w:tcPr>
+          <w:p>
+            <w:pPr>
+              <w:jc w:val="center"/>
+            </w:pPr>
+            <w:r>
+              <w:rPr>
+                <w:rFonts w:ascii="Arial" w:cs="Arial" w:eastAsia="Arial" w:hAnsi="Arial"/>
+                <w:b w:val="false"/>
+                <w:bCs w:val="false"/>
+                <w:sz w:val="20"/>
+                <w:szCs w:val="20"/>
+              </w:rPr>
+              <w:t xml:space="preserve">☐</w:t>
+            </w:r>
+          </w:p>
+        </w:tc>
+        <w:tc>
+          <w:tcPr>
+            <w:tcW w:type="dxa" w:w="600"/>
+            <w:tcBorders>
+              <w:top w:val="single" w:color="BBBBBB" w:sz="4"/>
+              <w:left w:val="single" w:color="BBBBBB" w:sz="4"/>
+              <w:bottom w:val="single" w:color="BBBBBB" w:sz="4"/>
+              <w:right w:val="single" w:color="BBBBBB" w:sz="4"/>
+            </w:tcBorders>
+            <w:tcMar>
+              <w:top w:type="dxa" w:w="60"/>
+              <w:left w:type="dxa" w:w="100"/>
+              <w:bottom w:type="dxa" w:w="60"/>
+              <w:right w:type="dxa" w:w="100"/>
+            </w:tcMar>
+          </w:tcPr>
+          <w:p>
+            <w:pPr>
+              <w:jc w:val="center"/>
+            </w:pPr>
+            <w:r>
+              <w:rPr>
+                <w:rFonts w:ascii="Arial" w:cs="Arial" w:eastAsia="Arial" w:hAnsi="Arial"/>
+                <w:b w:val="false"/>
+                <w:bCs w:val="false"/>
+                <w:sz w:val="20"/>
+                <w:szCs w:val="20"/>
+              </w:rPr>
+              <w:t xml:space="preserve">4</w:t>
+            </w:r>
+          </w:p>
+        </w:tc>
+        <w:tc>
+          <w:tcPr>
+            <w:tcW w:type="dxa" w:w="2700"/>
+            <w:tcBorders>
+              <w:top w:val="single" w:color="BBBBBB" w:sz="4"/>
+              <w:left w:val="single" w:color="BBBBBB" w:sz="4"/>
+              <w:bottom w:val="single" w:color="BBBBBB" w:sz="4"/>
+              <w:right w:val="single" w:color="BBBBBB" w:sz="4"/>
+            </w:tcBorders>
+            <w:tcMar>
+              <w:top w:type="dxa" w:w="60"/>
+              <w:left w:type="dxa" w:w="100"/>
+              <w:bottom w:type="dxa" w:w="60"/>
+              <w:right w:type="dxa" w:w="100"/>
+            </w:tcMar>
+          </w:tcPr>
+          <w:p>
+            <w:pPr>
+              <w:jc w:val="left"/>
+            </w:pPr>
+            <w:r>
+              <w:rPr>
+                <w:rFonts w:ascii="Arial" w:cs="Arial" w:eastAsia="Arial" w:hAnsi="Arial"/>
+                <w:b w:val="false"/>
+                <w:bCs w:val="false"/>
+                <w:sz w:val="20"/>
+                <w:szCs w:val="20"/>
+              </w:rPr>
+              <w:t xml:space="preserve">3mm red LED</w:t>
+            </w:r>
+          </w:p>
+        </w:tc>
+        <w:tc>
+          <w:tcPr>
+            <w:tcW w:type="dxa" w:w="2600"/>
+            <w:tcBorders>
+              <w:top w:val="single" w:color="BBBBBB" w:sz="4"/>
+              <w:left w:val="single" w:color="BBBBBB" w:sz="4"/>
+              <w:bottom w:val="single" w:color="BBBBBB" w:sz="4"/>
+              <w:right w:val="single" w:color="BBBBBB" w:sz="4"/>
+            </w:tcBorders>
+            <w:tcMar>
+              <w:top w:type="dxa" w:w="60"/>
+              <w:left w:type="dxa" w:w="100"/>
+              <w:bottom w:type="dxa" w:w="60"/>
+              <w:right w:type="dxa" w:w="100"/>
+            </w:tcMar>
+          </w:tcPr>
+          <w:p>
+            <w:pPr>
+              <w:jc w:val="left"/>
+            </w:pPr>
+            <w:r>
+              <w:rPr>
+                <w:rFonts w:ascii="Arial" w:cs="Arial" w:eastAsia="Arial" w:hAnsi="Arial"/>
+                <w:b w:val="false"/>
+                <w:bCs w:val="false"/>
+                <w:sz w:val="20"/>
+                <w:szCs w:val="20"/>
+              </w:rPr>
+              <w:t xml:space="preserve">A-261</w:t>
+            </w:r>
+          </w:p>
+        </w:tc>
+        <w:tc>
+          <w:tcPr>
+            <w:tcW w:type="dxa" w:w="2760"/>
+            <w:tcBorders>
+              <w:top w:val="single" w:color="BBBBBB" w:sz="4"/>
+              <w:left w:val="single" w:color="BBBBBB" w:sz="4"/>
+              <w:bottom w:val="single" w:color="BBBBBB" w:sz="4"/>
+              <w:right w:val="single" w:color="BBBBBB" w:sz="4"/>
+            </w:tcBorders>
+            <w:tcMar>
+              <w:top w:type="dxa" w:w="60"/>
+              <w:left w:type="dxa" w:w="100"/>
+              <w:bottom w:type="dxa" w:w="60"/>
+              <w:right w:type="dxa" w:w="100"/>
+            </w:tcMar>
+          </w:tcPr>
+          <w:p>
+            <w:pPr>
+              <w:jc w:val="left"/>
+            </w:pPr>
+            <w:r>
+              <w:rPr>
+                <w:rFonts w:ascii="Arial" w:cs="Arial" w:eastAsia="Arial" w:hAnsi="Arial"/>
+                <w:b w:val="false"/>
+                <w:bCs w:val="false"/>
+                <w:sz w:val="20"/>
+                <w:szCs w:val="20"/>
+              </w:rPr>
+              <w:t xml:space="preserve">An LED pair: louder, more open clipping</w:t>
+            </w:r>
+          </w:p>
+        </w:tc>
+      </w:tr>
+      <w:tr>
+        <w:tc>
+          <w:tcPr>
+            <w:tcW w:type="dxa" w:w="9360"/>
+            <w:gridSpan w:val="5"/>
+            <w:tcBorders>
+              <w:top w:val="single" w:color="BBBBBB" w:sz="4"/>
+              <w:left w:val="single" w:color="BBBBBB" w:sz="4"/>
+              <w:bottom w:val="single" w:color="BBBBBB" w:sz="4"/>
+              <w:right w:val="single" w:color="BBBBBB" w:sz="4"/>
+            </w:tcBorders>
+            <w:shd w:fill="F2F2F2" w:color="auto" w:val="clear"/>
+            <w:tcMar>
+              <w:top w:type="dxa" w:w="60"/>
+              <w:left w:type="dxa" w:w="100"/>
+              <w:bottom w:type="dxa" w:w="60"/>
+              <w:right w:type="dxa" w:w="100"/>
+            </w:tcMar>
+          </w:tcPr>
+          <w:p>
+            <w:r>
+              <w:rPr>
+                <w:rFonts w:ascii="Arial" w:cs="Arial" w:eastAsia="Arial" w:hAnsi="Arial"/>
+                <w:b/>
+                <w:bCs/>
+                <w:sz w:val="20"/>
+                <w:szCs w:val="20"/>
+              </w:rPr>
               <w:t xml:space="preserve">Resistors (1/4 W 1% metal film, sold in packs of 10)</w:t>
             </w:r>
           </w:p>
@@ -6162,6 +7005,24 @@
           <w:szCs w:val="22"/>
         </w:rPr>
         <w:t xml:space="preserve">1N34A germanium diodes: Tayda’s listing showed out of stock. If it still is, Small Bear Electronics and other pedal-parts shops carry them. Everything else can still come from Tayda.</w:t>
+      </w:r>
+    </w:p>
+    <w:p>
+      <w:pPr>
+        <w:pStyle w:val="ListParagraph"/>
+        <w:numPr>
+          <w:ilvl w:val="0"/>
+          <w:numId w:val="2"/>
+        </w:numPr>
+        <w:spacing w:after="80"/>
+      </w:pPr>
+      <w:r>
+        <w:rPr>
+          <w:rFonts w:ascii="Arial" w:cs="Arial" w:eastAsia="Arial" w:hAnsi="Arial"/>
+          <w:sz w:val="22"/>
+          <w:szCs w:val="22"/>
+        </w:rPr>
+        <w:t xml:space="preserve">Clipping test diodes are optional. Each pair plugs into the Soft or Hard position in place of D1, D2 or D4, D5, two diodes facing opposite ways like the originals. Two 1N4148s in series on each side, or a different diode on each side, need no extra parts: the 1N4148 row already has 8 spares. Turn Level to match volume before comparing, since louder sounds better. Blue and white LEDs are left out: they need about 3 V, more than the LM741 can swing on 9 V.</w:t>
       </w:r>
     </w:p>
     <w:p>

</xml_diff>